<commit_message>
Travel consent templates — separate instructions page, remove branding, add CA §1189 disclaimer box, reformat complex to match standard
</commit_message>
<xml_diff>
--- a/assets/forms/travel_consent_standard.docx
+++ b/assets/forms/travel_consent_standard.docx
@@ -2,6 +2,40 @@
 <file path=word/document.xml><?xml version="1.0" encoding="utf-8"?>
 <w:document xmlns:wpc="http://schemas.microsoft.com/office/word/2010/wordprocessingCanvas" xmlns:mc="http://schemas.openxmlformats.org/markup-compatibility/2006" xmlns:o="urn:schemas-microsoft-com:office:office" xmlns:r="http://schemas.openxmlformats.org/officeDocument/2006/relationships" xmlns:m="http://schemas.openxmlformats.org/officeDocument/2006/math" xmlns:v="urn:schemas-microsoft-com:vml" xmlns:wp14="http://schemas.microsoft.com/office/word/2010/wordprocessingDrawing" xmlns:wp="http://schemas.openxmlformats.org/drawingml/2006/wordprocessingDrawing" xmlns:w10="urn:schemas-microsoft-com:office:word" xmlns:w="http://schemas.openxmlformats.org/wordprocessingml/2006/main" xmlns:w14="http://schemas.microsoft.com/office/word/2010/wordml" xmlns:w15="http://schemas.microsoft.com/office/word/2012/wordml" xmlns:wpg="http://schemas.microsoft.com/office/word/2010/wordprocessingGroup" xmlns:wpi="http://schemas.microsoft.com/office/word/2010/wordprocessingInk" xmlns:wne="http://schemas.microsoft.com/office/word/2006/wordml" xmlns:wps="http://schemas.microsoft.com/office/word/2010/wordprocessingShape" xmlns:cx="http://schemas.microsoft.com/office/drawing/2014/chartex" xmlns:cx1="http://schemas.microsoft.com/office/drawing/2015/9/8/chartex" xmlns:cx2="http://schemas.microsoft.com/office/drawing/2015/10/21/chartex" xmlns:cx3="http://schemas.microsoft.com/office/drawing/2016/5/9/chartex" xmlns:cx4="http://schemas.microsoft.com/office/drawing/2016/5/10/chartex" xmlns:cx5="http://schemas.microsoft.com/office/drawing/2016/5/11/chartex" xmlns:cx6="http://schemas.microsoft.com/office/drawing/2016/5/12/chartex" xmlns:cx7="http://schemas.microsoft.com/office/drawing/2016/5/13/chartex" xmlns:cx8="http://schemas.microsoft.com/office/drawing/2016/5/14/chartex" xmlns:aink="http://schemas.microsoft.com/office/drawing/2016/ink" xmlns:am3d="http://schemas.microsoft.com/office/drawing/2017/model3d" xmlns:w16cex="http://schemas.microsoft.com/office/word/2018/wordml/cex" xmlns:w16cid="http://schemas.microsoft.com/office/word/2016/wordml/cid" xmlns:w16="http://schemas.microsoft.com/office/word/2018/wordml" xmlns:w16sdtdh="http://schemas.microsoft.com/office/word/2020/wordml/sdtdatahash" xmlns:w16se="http://schemas.microsoft.com/office/word/2015/wordml/symex" mc:Ignorable="w14 w15 wp14">
   <w:body>
+    <w:p>
+      <w:pPr>
+        <w:spacing w:after="240" w:before="120"/>
+        <w:jc w:val="center"/>
+      </w:pPr>
+      <w:r>
+        <w:rPr>
+          <w:rFonts w:ascii="Calibri" w:cs="Calibri" w:eastAsia="Calibri" w:hAnsi="Calibri"/>
+          <w:b/>
+          <w:bCs/>
+          <w:color w:val="01696F"/>
+          <w:sz w:val="32"/>
+          <w:szCs w:val="32"/>
+        </w:rPr>
+        <w:t xml:space="preserve">TRAVEL CONSENT LETTER FOR MINOR</w:t>
+      </w:r>
+    </w:p>
+    <w:p>
+      <w:pPr>
+        <w:spacing w:after="400"/>
+        <w:jc w:val="center"/>
+      </w:pPr>
+      <w:r>
+        <w:rPr>
+          <w:rFonts w:ascii="Calibri" w:cs="Calibri" w:eastAsia="Calibri" w:hAnsi="Calibri"/>
+          <w:i/>
+          <w:iCs/>
+          <w:color w:val="7A7974"/>
+          <w:sz w:val="22"/>
+          <w:szCs w:val="22"/>
+        </w:rPr>
+        <w:t xml:space="preserve">Standard Round-Trip — Instructions</w:t>
+      </w:r>
+    </w:p>
     <w:p>
       <w:pPr>
         <w:shd w:fill="F7F6F2" w:val="clear"/>
@@ -17,13 +51,13 @@
           <w:sz w:val="20"/>
           <w:szCs w:val="20"/>
         </w:rPr>
-        <w:t xml:space="preserve">IMPORTANT — READ BEFORE USING THIS TEMPLATE</w:t>
+        <w:t xml:space="preserve">READ BEFORE USING THIS TEMPLATE</w:t>
       </w:r>
     </w:p>
     <w:p>
       <w:pPr>
         <w:shd w:fill="F7F6F2" w:val="clear"/>
-        <w:spacing w:after="60"/>
+        <w:spacing w:after="240"/>
         <w:ind w:left="120" w:right="120"/>
       </w:pPr>
       <w:r>
@@ -32,23 +66,10 @@
           <w:i/>
           <w:iCs/>
           <w:color w:val="7A7974"/>
-          <w:sz w:val="18"/>
-          <w:szCs w:val="18"/>
-        </w:rPr>
-        <w:t xml:space="preserve">This is a self-help template Mobile American Notary provides as a courtesy. We are a notary public service — we notarize signatures only. We do not provide legal advice, do not select which template applies to your situation, and do not fill in substantive content on your behalf. If your situation involves a custody dispute, sole custody, a deceased parent, unusual travel arrangements, or competing court orders, consult a family-law attorney before signing.</w:t>
-      </w:r>
-    </w:p>
-    <w:p>
-      <w:pPr>
-        <w:spacing w:after="120"/>
-      </w:pPr>
-      <w:r>
-        <w:rPr>
-          <w:rFonts w:ascii="Calibri" w:cs="Calibri" w:eastAsia="Calibri" w:hAnsi="Calibri"/>
           <w:sz w:val="20"/>
           <w:szCs w:val="20"/>
         </w:rPr>
-        <w:t xml:space="preserve"/>
+        <w:t xml:space="preserve">This is a generic self-help template. It is not legal advice. It is not guaranteed to be accepted by any specific border officer, airline, embassy, consulate, or foreign authority. Whether this template fits your situation is a legal question. If the minor's situation involves a custody dispute, sole custody, a deceased parent, unusual travel arrangements, or competing court orders, consult a licensed family-law attorney before signing.</w:t>
       </w:r>
     </w:p>
     <w:p>
@@ -86,7 +107,7 @@
           <w:sz w:val="20"/>
           <w:szCs w:val="20"/>
         </w:rPr>
-        <w:t xml:space="preserve">NOTARY INSTRUCTION: </w:t>
+        <w:t xml:space="preserve">SCOPE: </w:t>
       </w:r>
       <w:r>
         <w:rPr>
@@ -97,7 +118,7 @@
           <w:sz w:val="20"/>
           <w:szCs w:val="20"/>
         </w:rPr>
-        <w:t xml:space="preserve">This is Mobile American Notary's "Standard Round-Trip" consent template — one accompanying adult, one destination, one return-by date. If travel involves multiple countries, multiple accompanying adults on different legs, or split custody arrangements, use the "Complex Multi-Leg" template instead.</w:t>
+        <w:t xml:space="preserve">This is the "Standard Round-Trip" version — one minor, one accompanying adult, one destination country, one return-by date. If travel involves multiple countries, multiple accompanying adults on different legs, or split custody arrangements, use the "Complex Multi-Leg" version instead.</w:t>
       </w:r>
     </w:p>
     <w:p>
@@ -118,7 +139,7 @@
           <w:sz w:val="20"/>
           <w:szCs w:val="20"/>
         </w:rPr>
-        <w:t xml:space="preserve">NOTARY INSTRUCTION: </w:t>
+        <w:t xml:space="preserve">CLIENT: </w:t>
       </w:r>
       <w:r>
         <w:rPr>
@@ -129,7 +150,7 @@
           <w:sz w:val="20"/>
           <w:szCs w:val="20"/>
         </w:rPr>
-        <w:t xml:space="preserve">Client instruction: Open in Word, "Save As" with your family name + travel date (e.g. "Smith_TravelConsent_2026-07-15.docx"), then fill in the blanks. Print single-sided.</w:t>
+        <w:t xml:space="preserve">Open in Word, "Save As" with the family name and travel date (for example "Smith_TravelConsent_2026-07-15.docx"), then fill in the blanks. Print single-sided. Do not sign until you are in front of a Notary Public.</w:t>
       </w:r>
     </w:p>
     <w:p>
@@ -150,7 +171,7 @@
           <w:sz w:val="20"/>
           <w:szCs w:val="20"/>
         </w:rPr>
-        <w:t xml:space="preserve">NOTARY INSTRUCTION: </w:t>
+        <w:t xml:space="preserve">NOTARY: </w:t>
       </w:r>
       <w:r>
         <w:rPr>
@@ -161,7 +182,7 @@
           <w:sz w:val="20"/>
           <w:szCs w:val="20"/>
         </w:rPr>
-        <w:t xml:space="preserve">Notary instruction: Identify each signer per California ID requirements, have them sign in your presence, then attach the California All-Purpose Acknowledgment on the last page. Journal each signer. If both parents sign at different times or locations, use a separate acknowledgment for each.</w:t>
+        <w:t xml:space="preserve">Identify each signer per California ID requirements, have them sign in your presence, then attach the California All-Purpose Acknowledgment on the last page. Journal each signer. If both parents sign at different times or locations, use a separate acknowledgment for each signature.</w:t>
       </w:r>
     </w:p>
     <w:p>
@@ -182,7 +203,7 @@
           <w:sz w:val="20"/>
           <w:szCs w:val="20"/>
         </w:rPr>
-        <w:t xml:space="preserve">NOTARY INSTRUCTION: </w:t>
+        <w:t xml:space="preserve">APOSTILLE: </w:t>
       </w:r>
       <w:r>
         <w:rPr>
@@ -193,12 +214,17 @@
           <w:sz w:val="20"/>
           <w:szCs w:val="20"/>
         </w:rPr>
-        <w:t xml:space="preserve">For Hague Convention destinations needing an Apostille: acknowledge the signature(s), then the document goes to the California Secretary of State. Do not staple the acknowledgment to the letter — keep it as a separate page that can be apostilled.</w:t>
-      </w:r>
-    </w:p>
-    <w:p>
-      <w:pPr>
-        <w:spacing w:after="240"/>
+        <w:t xml:space="preserve">For Hague Convention destinations requiring an Apostille: acknowledge the signature(s), then the document goes to the California Secretary of State. Do not staple the acknowledgment to the letter — keep it as a separate page that can be apostilled.</w:t>
+      </w:r>
+    </w:p>
+    <w:p>
+      <w:r>
+        <w:br w:type="page"/>
+      </w:r>
+    </w:p>
+    <w:p>
+      <w:pPr>
+        <w:spacing w:after="240" w:before="120"/>
         <w:jc w:val="center"/>
       </w:pPr>
       <w:r>
@@ -211,23 +237,6 @@
           <w:szCs w:val="32"/>
         </w:rPr>
         <w:t xml:space="preserve">TRAVEL CONSENT LETTER FOR MINOR</w:t>
-      </w:r>
-    </w:p>
-    <w:p>
-      <w:pPr>
-        <w:spacing w:after="300"/>
-        <w:jc w:val="center"/>
-      </w:pPr>
-      <w:r>
-        <w:rPr>
-          <w:rFonts w:ascii="Calibri" w:cs="Calibri" w:eastAsia="Calibri" w:hAnsi="Calibri"/>
-          <w:i/>
-          <w:iCs/>
-          <w:color w:val="7A7974"/>
-          <w:sz w:val="22"/>
-          <w:szCs w:val="22"/>
-        </w:rPr>
-        <w:t xml:space="preserve">Standard Round-Trip — Mobile American Notary</w:t>
       </w:r>
     </w:p>
     <w:p>
@@ -303,7 +312,7 @@
           <w:sz w:val="20"/>
           <w:szCs w:val="20"/>
         </w:rPr>
-        <w:t xml:space="preserve">NOTARY INSTRUCTION: </w:t>
+        <w:t xml:space="preserve">NOTE: </w:t>
       </w:r>
       <w:r>
         <w:rPr>
@@ -761,7 +770,7 @@
           <w:sz w:val="20"/>
           <w:szCs w:val="20"/>
         </w:rPr>
-        <w:t xml:space="preserve">NOTARY INSTRUCTION: </w:t>
+        <w:t xml:space="preserve">NOTE: </w:t>
       </w:r>
       <w:r>
         <w:rPr>
@@ -1017,7 +1026,7 @@
           <w:sz w:val="20"/>
           <w:szCs w:val="20"/>
         </w:rPr>
-        <w:t xml:space="preserve">NOTARY INSTRUCTION: </w:t>
+        <w:t xml:space="preserve">IMPORTANT: </w:t>
       </w:r>
       <w:r>
         <w:rPr>
@@ -1028,7 +1037,7 @@
           <w:sz w:val="20"/>
           <w:szCs w:val="20"/>
         </w:rPr>
-        <w:t xml:space="preserve">The "no later than" return date is important. Many border officers treat consent as expiring on that date. If travel plans slip, the consenting parent(s) should sign an updated letter — do not rely on the accompanying adult's verbal explanation at the border.</w:t>
+        <w:t xml:space="preserve">The "no later than" return date matters. Many border officers treat consent as expiring on that date. If travel plans slip, the consenting parent(s) should sign an updated letter — do not rely on the accompanying adult's verbal explanation at the border.</w:t>
       </w:r>
     </w:p>
     <w:p>
@@ -1234,7 +1243,7 @@
           <w:sz w:val="20"/>
           <w:szCs w:val="20"/>
         </w:rPr>
-        <w:t xml:space="preserve">NOTARY INSTRUCTION: </w:t>
+        <w:t xml:space="preserve">NOTARY: </w:t>
       </w:r>
       <w:r>
         <w:rPr>
@@ -1453,7 +1462,14 @@
     </w:p>
     <w:p>
       <w:pPr>
-        <w:spacing w:after="120"/>
+        <w:pBdr>
+          <w:top w:val="single" w:color="28251D" w:sz="8" w:space="6"/>
+          <w:bottom w:val="single" w:color="28251D" w:sz="8" w:space="6"/>
+          <w:left w:val="single" w:color="28251D" w:sz="8" w:space="6"/>
+          <w:right w:val="single" w:color="28251D" w:sz="8" w:space="6"/>
+        </w:pBdr>
+        <w:spacing w:after="200" w:before="60"/>
+        <w:ind w:left="120" w:right="120"/>
       </w:pPr>
       <w:r>
         <w:rPr>
@@ -1687,8 +1703,7 @@
       </w:r>
     </w:p>
     <w:sectPr>
-      <w:headerReference w:type="default" r:id="rId7"/>
-      <w:footerReference w:type="default" r:id="rId8"/>
+      <w:footerReference w:type="default" r:id="rId7"/>
       <w:pgSz w:w="11906" w:h="16838" w:orient="portrait"/>
       <w:pgMar w:top="720" w:right="720" w:bottom="720" w:left="720" w:header="708" w:footer="708" w:gutter="0"/>
       <w:pgNumType/>
@@ -1754,7 +1769,7 @@
         <w:sz w:val="16"/>
         <w:szCs w:val="16"/>
       </w:rPr>
-      <w:t xml:space="preserve">Travel Consent — Standard Round-Trip  ·  Client self-help template  ·  Not legal advice</w:t>
+      <w:t xml:space="preserve">Travel Consent — Standard Round-Trip  ·  Self-help template  ·  Not legal advice</w:t>
     </w:r>
   </w:p>
 </w:ftr>
@@ -1795,25 +1810,6 @@
     </w:p>
   </w:footnote>
 </w:footnotes>
-</file>
-
-<file path=word/header1.xml><?xml version="1.0" encoding="utf-8"?>
-<w:hdr xmlns:wpc="http://schemas.microsoft.com/office/word/2010/wordprocessingCanvas" xmlns:mc="http://schemas.openxmlformats.org/markup-compatibility/2006" xmlns:o="urn:schemas-microsoft-com:office:office" xmlns:r="http://schemas.openxmlformats.org/officeDocument/2006/relationships" xmlns:m="http://schemas.openxmlformats.org/officeDocument/2006/math" xmlns:v="urn:schemas-microsoft-com:vml" xmlns:wp14="http://schemas.microsoft.com/office/word/2010/wordprocessingDrawing" xmlns:wp="http://schemas.openxmlformats.org/drawingml/2006/wordprocessingDrawing" xmlns:w10="urn:schemas-microsoft-com:office:word" xmlns:w="http://schemas.openxmlformats.org/wordprocessingml/2006/main" xmlns:w14="http://schemas.microsoft.com/office/word/2010/wordml" xmlns:w15="http://schemas.microsoft.com/office/word/2012/wordml" xmlns:wpg="http://schemas.microsoft.com/office/word/2010/wordprocessingGroup" xmlns:wpi="http://schemas.microsoft.com/office/word/2010/wordprocessingInk" xmlns:wne="http://schemas.microsoft.com/office/word/2006/wordml" xmlns:wps="http://schemas.microsoft.com/office/word/2010/wordprocessingShape" xmlns:cx="http://schemas.microsoft.com/office/drawing/2014/chartex" xmlns:cx1="http://schemas.microsoft.com/office/drawing/2015/9/8/chartex" xmlns:cx2="http://schemas.microsoft.com/office/drawing/2015/10/21/chartex" xmlns:cx3="http://schemas.microsoft.com/office/drawing/2016/5/9/chartex" xmlns:cx4="http://schemas.microsoft.com/office/drawing/2016/5/10/chartex" xmlns:cx5="http://schemas.microsoft.com/office/drawing/2016/5/11/chartex" xmlns:cx6="http://schemas.microsoft.com/office/drawing/2016/5/12/chartex" xmlns:cx7="http://schemas.microsoft.com/office/drawing/2016/5/13/chartex" xmlns:cx8="http://schemas.microsoft.com/office/drawing/2016/5/14/chartex" xmlns:w16cid="http://schemas.microsoft.com/office/word/2016/wordml/cid" xmlns:w16se="http://schemas.microsoft.com/office/word/2015/wordml/symex">
-  <w:p>
-    <w:pPr>
-      <w:jc w:val="right"/>
-    </w:pPr>
-    <w:r>
-      <w:rPr>
-        <w:rFonts w:ascii="Calibri" w:cs="Calibri" w:eastAsia="Calibri" w:hAnsi="Calibri"/>
-        <w:color w:val="7A7974"/>
-        <w:sz w:val="16"/>
-        <w:szCs w:val="16"/>
-      </w:rPr>
-      <w:t xml:space="preserve">Mobile American Notary  ·  (213) 933‑2507  ·  mobileamericannotary.com</w:t>
-    </w:r>
-  </w:p>
-</w:hdr>
 </file>
 
 <file path=word/numbering.xml><?xml version="1.0" encoding="utf-8"?>

</xml_diff>